<commit_message>
Fix Beaver figure reference and reword the introduction prompt
Beaver (1968) Fig. 5 is the nonreport-period distribution of U_t, used as
the benchmark for judging the report-period values. Fig. 6 is "Price
Residual Analysis", the 17-week event plot that fig2-return-variability
actually reproduces. Corrected in the script header, the section comment,
the figure caption, and both write-up skeletons.

The introduction prompt asked what the student is "doing about it", which
implies Beaver's question is a problem to be remedied. Now asks what the
replication does.

The .docx is a build artifact of make-writeup-template.R; officer is not
available outside renv here, so the two strings were patched directly in
word/document.xml with every other part of the archive copied through
unchanged.

Co-Authored-By: Claude Opus 5 (1M context) <noreply@anthropic.com>
</commit_message>
<xml_diff>
--- a/writeup/writeup-template.docx
+++ b/writeup/writeup-template.docx
@@ -95,7 +95,7 @@
         <w:pStyle w:val="Normal"/>
       </w:pPr>
       <w:r>
-        <w:t xml:space="preserve">What question did Beaver ask, why did it matter in 1968, and what are you doing about it? Two or three paragraphs.</w:t>
+        <w:t xml:space="preserve">What question did Beaver ask, why did it matter in 1968, and what does your replication do? Two or three paragraphs.</w:t>
       </w:r>
     </w:p>
     <w:p>
@@ -223,7 +223,7 @@
         <w:pStyle w:val="Normal"/>
       </w:pPr>
       <w:r>
-        <w:t xml:space="preserve">[ Paste Figure 2: Return variability (compare to Beaver Fig. 5) ]</w:t>
+        <w:t xml:space="preserve">[ Paste Figure 2: Return variability (compare to Beaver Fig. 6) ]</w:t>
       </w:r>
     </w:p>
     <w:p>

</xml_diff>